<commit_message>
Spanish series: male protagonist (Lucas Ferrer)
Co-Authored-By: Claude Opus 5.5 <noreply@anthropic.com>
Claude-Session: https://claude.ai/code/session_014Pwa4fJotSRvNewqVrvk7U
</commit_message>
<xml_diff>
--- a/business_es/part1/ep01_Primer_dia.docx
+++ b/business_es/part1/ep01_Primer_dia.docx
@@ -180,7 +180,7 @@
                 <w:b w:val="0"/>
                 <w:sz w:val="19"/>
               </w:rPr>
-              <w:t>Lucía Ferrer (수출 책임자, 첫 출근) · Pepe Llorens (공장장) · Vicente Albalat (대표) · Amparo Albalat (국내영업 책임자, 대표의 딸) · Alejandra Garza (몬테레이 바이어, 전화) · Toni (경비)</w:t>
+              <w:t>Lucas Ferrer (수출 책임자, 첫 출근) · Pepe Llorens (공장장) · Vicente Albalat (대표) · Amparo Albalat (국내영업 책임자, 대표의 딸) · Alejandra Garza (몬테레이 바이어, 전화) · Toni (경비)</w:t>
             </w:r>
           </w:p>
         </w:tc>
@@ -303,7 +303,7 @@
                 <w:b w:val="0"/>
                 <w:sz w:val="19"/>
               </w:rPr>
-              <w:t>대화 120턴 (Lucía 54 · Pepe 23 · Vicente 20 · Alejandra 12 · Amparo 8 · Toni 3) · A2 25% / B1 45% / B2 25% / C1 5% 목표</w:t>
+              <w:t>대화 120턴 (Lucas 54 · Pepe 23 · Vicente 20 · Alejandra 12 · Amparo 8 · Toni 3) · A2 25% / B1 45% / B2 25% / C1 5% 목표</w:t>
             </w:r>
           </w:p>
         </w:tc>
@@ -352,7 +352,7 @@
           <w:rFonts w:ascii="Calibri" w:hAnsi="Calibri" w:eastAsia="Malgun Gothic"/>
           <w:sz w:val="20"/>
         </w:rPr>
-        <w:t>마드리드의 컨설팅 회사에서 일하던 루시아 페레르가 카스테욘 주 온다의 가족 경영 타일 회사 '세라미카스 알발라트'에 첫 출근한다. 오전에는 공장장 페페와 함께 분무건조기, 프레스, 가마, 재고 창고를 돌아보고, 점심에는 대표 비센테와 국도변 식당에서 식사를 한다. 회사의 문제는 숫자가 아니라 멈춘 가마, 꽉 찬 창고, 대표 딸의 냉담한 인사를 통해 조금씩 드러난다. 그리고 퇴근 무렵, 멕시코에서 예상치 못한 전화가 걸려 온다.</w:t>
+        <w:t>마드리드의 컨설팅 회사에서 일하던 루카스 페레르가 카스테욘 주 온다의 가족 경영 타일 회사 '세라미카스 알발라트'에 첫 출근한다. 오전에는 공장장 페페와 함께 분무건조기, 프레스, 가마, 재고 창고를 돌아보고, 점심에는 대표 비센테와 국도변 식당에서 식사를 한다. 회사의 문제는 숫자가 아니라 멈춘 가마, 꽉 찬 창고, 대표 딸의 냉담한 인사를 통해 조금씩 드러난다. 그리고 퇴근 무렵, 멕시코에서 예상치 못한 전화가 걸려 온다.</w:t>
       </w:r>
     </w:p>
     <w:p>
@@ -376,7 +376,7 @@
           <w:rFonts w:ascii="Calibri" w:hAnsi="Calibri" w:eastAsia="Malgun Gothic"/>
           <w:sz w:val="20"/>
         </w:rPr>
-        <w:t>듣기 질문 ② 비센테가 '이 지역 사람이 아닌' 루시아를 뽑은 이유는 무엇인가?</w:t>
+        <w:t>듣기 질문 ② 비센테가 '이 지역 사람이 아닌' 루카스를 뽑은 이유는 무엇인가?</w:t>
       </w:r>
     </w:p>
     <w:p>
@@ -452,7 +452,7 @@
           <w:color w:val="666666"/>
           <w:sz w:val="19"/>
         </w:rPr>
-        <w:t>Lunes 3 de febrero. Niebla sobre los campos de naranjos. Un camión cargado de palés sale por la puerta principal de Cerámicas Albalat. Lucía Ferrer, 34 años, aparca un coche con matrícula de Madrid junto a la garita.</w:t>
+        <w:t>Lunes 3 de febrero. Niebla sobre los campos de naranjos. Un camión cargado de palés sale por la puerta principal de Cerámicas Albalat. Lucas Ferrer, 34 años, aparca un coche con matrícula de Madrid junto a la garita.</w:t>
       </w:r>
     </w:p>
     <w:p>
@@ -496,7 +496,7 @@
           <w:color w:val="1F5A8C"/>
           <w:sz w:val="21"/>
         </w:rPr>
-        <w:t>Lucía:</w:t>
+        <w:t>Lucas:</w:t>
       </w:r>
       <w:r>
         <w:rPr>
@@ -504,7 +504,7 @@
           <w:sz w:val="22"/>
         </w:rPr>
         <w:tab/>
-        <w:t>Buenos días. Soy Lucía Ferrer. Hoy empiezo a trabajar aquí. Tengo una cita con el señor Llorens.</w:t>
+        <w:t>Buenos días. Soy Lucas Ferrer. Hoy empiezo a trabajar aquí. Tengo una cita con el señor Llorens.</w:t>
       </w:r>
     </w:p>
     <w:p>
@@ -530,7 +530,7 @@
           <w:sz w:val="22"/>
         </w:rPr>
         <w:tab/>
-        <w:t>¡Ah, la nueva de exportación! Pepe la está esperando en la nave de prensas. Póngase esto, es obligatorio.</w:t>
+        <w:t>¡Ah, el nuevo de exportación! Pepe lo está esperando en la nave de prensas. Póngase esto, es obligatorio.</w:t>
       </w:r>
     </w:p>
     <w:p>
@@ -548,7 +548,7 @@
           <w:color w:val="1F5A8C"/>
           <w:sz w:val="21"/>
         </w:rPr>
-        <w:t>Lucía:</w:t>
+        <w:t>Lucas:</w:t>
       </w:r>
       <w:r>
         <w:rPr>
@@ -597,7 +597,7 @@
           <w:color w:val="666666"/>
           <w:sz w:val="19"/>
         </w:rPr>
-        <w:t>Lucía se pone el chaleco reflectante y las gafas. Dentro, el ruido es ensordecedor. Un hombre de unos sesenta años, con mono azul, levanta la mano.</w:t>
+        <w:t>Lucas se pone el chaleco reflectante y las gafas. Dentro, el ruido es ensordecedor. Un hombre de unos sesenta años, con mono azul, levanta la mano.</w:t>
       </w:r>
     </w:p>
     <w:p>
@@ -623,7 +623,7 @@
           <w:sz w:val="22"/>
         </w:rPr>
         <w:tab/>
-        <w:t>¡Bon dia! Tú debes de ser Lucía. Yo soy Pepe, el jefe de planta. Aquí nos tuteamos todos, ¿vale?</w:t>
+        <w:t>¡Bon dia! Tú debes de ser Lucas. Yo soy Pepe, el jefe de planta. Aquí nos tuteamos todos, ¿vale?</w:t>
       </w:r>
     </w:p>
     <w:p>
@@ -641,7 +641,7 @@
           <w:color w:val="1F5A8C"/>
           <w:sz w:val="21"/>
         </w:rPr>
-        <w:t>Lucía:</w:t>
+        <w:t>Lucas:</w:t>
       </w:r>
       <w:r>
         <w:rPr>
@@ -649,7 +649,7 @@
           <w:sz w:val="22"/>
         </w:rPr>
         <w:tab/>
-        <w:t>Vale, perfecto. Encantada, Pepe. Gracias por recibirme tan temprano.</w:t>
+        <w:t>Vale, perfecto. Encantado, Pepe. Gracias por recibirme tan temprano.</w:t>
       </w:r>
     </w:p>
     <w:p>
@@ -693,7 +693,7 @@
           <w:color w:val="1F5A8C"/>
           <w:sz w:val="21"/>
         </w:rPr>
-        <w:t>Lucía:</w:t>
+        <w:t>Lucas:</w:t>
       </w:r>
       <w:r>
         <w:rPr>
@@ -745,7 +745,7 @@
           <w:color w:val="1F5A8C"/>
           <w:sz w:val="21"/>
         </w:rPr>
-        <w:t>Lucía:</w:t>
+        <w:t>Lucas:</w:t>
       </w:r>
       <w:r>
         <w:rPr>
@@ -753,7 +753,7 @@
           <w:sz w:val="22"/>
         </w:rPr>
         <w:tab/>
-        <w:t>¿El atomizador? Perdona, pero soy nueva en el sector. ¿Qué es exactamente?</w:t>
+        <w:t>¿El atomizador? Perdona, pero soy nuevo en el sector. ¿Qué es exactamente?</w:t>
       </w:r>
     </w:p>
     <w:p>
@@ -797,7 +797,7 @@
           <w:color w:val="1F5A8C"/>
           <w:sz w:val="21"/>
         </w:rPr>
-        <w:t>Lucía:</w:t>
+        <w:t>Lucas:</w:t>
       </w:r>
       <w:r>
         <w:rPr>
@@ -849,7 +849,7 @@
           <w:color w:val="1F5A8C"/>
           <w:sz w:val="21"/>
         </w:rPr>
-        <w:t>Lucía:</w:t>
+        <w:t>Lucas:</w:t>
       </w:r>
       <w:r>
         <w:rPr>
@@ -901,7 +901,7 @@
           <w:color w:val="1F5A8C"/>
           <w:sz w:val="21"/>
         </w:rPr>
-        <w:t>Lucía:</w:t>
+        <w:t>Lucas:</w:t>
       </w:r>
       <w:r>
         <w:rPr>
@@ -953,7 +953,7 @@
           <w:color w:val="1F5A8C"/>
           <w:sz w:val="21"/>
         </w:rPr>
-        <w:t>Lucía:</w:t>
+        <w:t>Lucas:</w:t>
       </w:r>
       <w:r>
         <w:rPr>
@@ -1005,7 +1005,7 @@
           <w:color w:val="1F5A8C"/>
           <w:sz w:val="21"/>
         </w:rPr>
-        <w:t>Lucía:</w:t>
+        <w:t>Lucas:</w:t>
       </w:r>
       <w:r>
         <w:rPr>
@@ -1057,7 +1057,7 @@
           <w:color w:val="1F5A8C"/>
           <w:sz w:val="21"/>
         </w:rPr>
-        <w:t>Lucía:</w:t>
+        <w:t>Lucas:</w:t>
       </w:r>
       <w:r>
         <w:rPr>
@@ -1109,7 +1109,7 @@
           <w:color w:val="1F5A8C"/>
           <w:sz w:val="21"/>
         </w:rPr>
-        <w:t>Lucía:</w:t>
+        <w:t>Lucas:</w:t>
       </w:r>
       <w:r>
         <w:rPr>
@@ -1176,7 +1176,7 @@
           <w:color w:val="1F5A8C"/>
           <w:sz w:val="21"/>
         </w:rPr>
-        <w:t>Lucía:</w:t>
+        <w:t>Lucas:</w:t>
       </w:r>
       <w:r>
         <w:rPr>
@@ -1228,7 +1228,7 @@
           <w:color w:val="1F5A8C"/>
           <w:sz w:val="21"/>
         </w:rPr>
-        <w:t>Lucía:</w:t>
+        <w:t>Lucas:</w:t>
       </w:r>
       <w:r>
         <w:rPr>
@@ -1280,7 +1280,7 @@
           <w:color w:val="1F5A8C"/>
           <w:sz w:val="21"/>
         </w:rPr>
-        <w:t>Lucía:</w:t>
+        <w:t>Lucas:</w:t>
       </w:r>
       <w:r>
         <w:rPr>
@@ -1332,7 +1332,7 @@
           <w:color w:val="1F5A8C"/>
           <w:sz w:val="21"/>
         </w:rPr>
-        <w:t>Lucía:</w:t>
+        <w:t>Lucas:</w:t>
       </w:r>
       <w:r>
         <w:rPr>
@@ -1384,7 +1384,7 @@
           <w:color w:val="1F5A8C"/>
           <w:sz w:val="21"/>
         </w:rPr>
-        <w:t>Lucía:</w:t>
+        <w:t>Lucas:</w:t>
       </w:r>
       <w:r>
         <w:rPr>
@@ -1436,7 +1436,7 @@
           <w:color w:val="1F5A8C"/>
           <w:sz w:val="21"/>
         </w:rPr>
-        <w:t>Lucía:</w:t>
+        <w:t>Lucas:</w:t>
       </w:r>
       <w:r>
         <w:rPr>
@@ -1488,7 +1488,7 @@
           <w:color w:val="1F5A8C"/>
           <w:sz w:val="21"/>
         </w:rPr>
-        <w:t>Lucía:</w:t>
+        <w:t>Lucas:</w:t>
       </w:r>
       <w:r>
         <w:rPr>
@@ -1555,7 +1555,7 @@
           <w:color w:val="1F5A8C"/>
           <w:sz w:val="21"/>
         </w:rPr>
-        <w:t>Lucía:</w:t>
+        <w:t>Lucas:</w:t>
       </w:r>
       <w:r>
         <w:rPr>
@@ -1607,7 +1607,7 @@
           <w:color w:val="1F5A8C"/>
           <w:sz w:val="21"/>
         </w:rPr>
-        <w:t>Lucía:</w:t>
+        <w:t>Lucas:</w:t>
       </w:r>
       <w:r>
         <w:rPr>
@@ -1659,7 +1659,7 @@
           <w:color w:val="1F5A8C"/>
           <w:sz w:val="21"/>
         </w:rPr>
-        <w:t>Lucía:</w:t>
+        <w:t>Lucas:</w:t>
       </w:r>
       <w:r>
         <w:rPr>
@@ -1711,7 +1711,7 @@
           <w:color w:val="1F5A8C"/>
           <w:sz w:val="21"/>
         </w:rPr>
-        <w:t>Lucía:</w:t>
+        <w:t>Lucas:</w:t>
       </w:r>
       <w:r>
         <w:rPr>
@@ -1763,7 +1763,7 @@
           <w:color w:val="1F5A8C"/>
           <w:sz w:val="21"/>
         </w:rPr>
-        <w:t>Lucía:</w:t>
+        <w:t>Lucas:</w:t>
       </w:r>
       <w:r>
         <w:rPr>
@@ -1797,7 +1797,7 @@
           <w:sz w:val="22"/>
         </w:rPr>
         <w:tab/>
-        <w:t>Aquí las cosas importantes se hablan comiendo, Lucía. Bienvenida a Onda.</w:t>
+        <w:t>Aquí las cosas importantes se hablan comiendo, Lucas. Bienvenido a Onda.</w:t>
       </w:r>
     </w:p>
     <w:p>
@@ -1827,7 +1827,7 @@
           <w:color w:val="666666"/>
           <w:sz w:val="19"/>
         </w:rPr>
-        <w:t>Un restaurante famoso en la comarca por su arroz. Vicente Albalat, 64 años, ya está sentado en una mesa del fondo. Se levanta al verla entrar.</w:t>
+        <w:t>Un restaurante famoso en la comarca por su arroz. Vicente Albalat, 64 años, ya está sentado en una mesa del fondo. Se levanta al verlo entrar.</w:t>
       </w:r>
     </w:p>
     <w:p>
@@ -1853,7 +1853,7 @@
           <w:sz w:val="22"/>
         </w:rPr>
         <w:tab/>
-        <w:t>¡Lucía! Siéntate, siéntate. ¿Qué tal la mañana con Pepe?</w:t>
+        <w:t>¡Lucas! Siéntate, siéntate. ¿Qué tal la mañana con Pepe?</w:t>
       </w:r>
     </w:p>
     <w:p>
@@ -1871,7 +1871,7 @@
           <w:color w:val="1F5A8C"/>
           <w:sz w:val="21"/>
         </w:rPr>
-        <w:t>Lucía:</w:t>
+        <w:t>Lucas:</w:t>
       </w:r>
       <w:r>
         <w:rPr>
@@ -1923,7 +1923,7 @@
           <w:color w:val="1F5A8C"/>
           <w:sz w:val="21"/>
         </w:rPr>
-        <w:t>Lucía:</w:t>
+        <w:t>Lucas:</w:t>
       </w:r>
       <w:r>
         <w:rPr>
@@ -1975,7 +1975,7 @@
           <w:color w:val="1F5A8C"/>
           <w:sz w:val="21"/>
         </w:rPr>
-        <w:t>Lucía:</w:t>
+        <w:t>Lucas:</w:t>
       </w:r>
       <w:r>
         <w:rPr>
@@ -2027,7 +2027,7 @@
           <w:color w:val="1F5A8C"/>
           <w:sz w:val="21"/>
         </w:rPr>
-        <w:t>Lucía:</w:t>
+        <w:t>Lucas:</w:t>
       </w:r>
       <w:r>
         <w:rPr>
@@ -2079,7 +2079,7 @@
           <w:color w:val="1F5A8C"/>
           <w:sz w:val="21"/>
         </w:rPr>
-        <w:t>Lucía:</w:t>
+        <w:t>Lucas:</w:t>
       </w:r>
       <w:r>
         <w:rPr>
@@ -2131,7 +2131,7 @@
           <w:color w:val="1F5A8C"/>
           <w:sz w:val="21"/>
         </w:rPr>
-        <w:t>Lucía:</w:t>
+        <w:t>Lucas:</w:t>
       </w:r>
       <w:r>
         <w:rPr>
@@ -2183,7 +2183,7 @@
           <w:color w:val="1F5A8C"/>
           <w:sz w:val="21"/>
         </w:rPr>
-        <w:t>Lucía:</w:t>
+        <w:t>Lucas:</w:t>
       </w:r>
       <w:r>
         <w:rPr>
@@ -2235,7 +2235,7 @@
           <w:color w:val="1F5A8C"/>
           <w:sz w:val="21"/>
         </w:rPr>
-        <w:t>Lucía:</w:t>
+        <w:t>Lucas:</w:t>
       </w:r>
       <w:r>
         <w:rPr>
@@ -2287,7 +2287,7 @@
           <w:color w:val="1F5A8C"/>
           <w:sz w:val="21"/>
         </w:rPr>
-        <w:t>Lucía:</w:t>
+        <w:t>Lucas:</w:t>
       </w:r>
       <w:r>
         <w:rPr>
@@ -2339,7 +2339,7 @@
           <w:color w:val="1F5A8C"/>
           <w:sz w:val="21"/>
         </w:rPr>
-        <w:t>Lucía:</w:t>
+        <w:t>Lucas:</w:t>
       </w:r>
       <w:r>
         <w:rPr>
@@ -2432,7 +2432,7 @@
           <w:color w:val="1F5A8C"/>
           <w:sz w:val="21"/>
         </w:rPr>
-        <w:t>Lucía:</w:t>
+        <w:t>Lucas:</w:t>
       </w:r>
       <w:r>
         <w:rPr>
@@ -2484,7 +2484,7 @@
           <w:color w:val="1F5A8C"/>
           <w:sz w:val="21"/>
         </w:rPr>
-        <w:t>Lucía:</w:t>
+        <w:t>Lucas:</w:t>
       </w:r>
       <w:r>
         <w:rPr>
@@ -2536,7 +2536,7 @@
           <w:color w:val="1F5A8C"/>
           <w:sz w:val="21"/>
         </w:rPr>
-        <w:t>Lucía:</w:t>
+        <w:t>Lucas:</w:t>
       </w:r>
       <w:r>
         <w:rPr>
@@ -2570,7 +2570,7 @@
           <w:sz w:val="22"/>
         </w:rPr>
         <w:tab/>
-        <w:t>Vas a pisar a mucha gente, Lucía. Eso es justo lo que necesito. Pero písala con cuidado.</w:t>
+        <w:t>Vas a pisar a mucha gente, Lucas. Eso es justo lo que necesito. Pero písala con cuidado.</w:t>
       </w:r>
     </w:p>
     <w:p>
@@ -2637,7 +2637,7 @@
           <w:sz w:val="22"/>
         </w:rPr>
         <w:tab/>
-        <w:t>Amparo, siéntate. Te presento a Lucía Ferrer.</w:t>
+        <w:t>Amparo, siéntate. Te presento a Lucas Ferrer.</w:t>
       </w:r>
     </w:p>
     <w:p>
@@ -2663,7 +2663,7 @@
           <w:sz w:val="22"/>
         </w:rPr>
         <w:tab/>
-        <w:t>Encantada. Así que tú eres la de Madrid.</w:t>
+        <w:t>Encantada. Así que tú eres el de Madrid.</w:t>
       </w:r>
     </w:p>
     <w:p>
@@ -2681,7 +2681,7 @@
           <w:color w:val="1F5A8C"/>
           <w:sz w:val="21"/>
         </w:rPr>
-        <w:t>Lucía:</w:t>
+        <w:t>Lucas:</w:t>
       </w:r>
       <w:r>
         <w:rPr>
@@ -2689,7 +2689,7 @@
           <w:sz w:val="22"/>
         </w:rPr>
         <w:tab/>
-        <w:t>La de Madrid, sí. Aunque mi abuela era de Burriana, así que algo de aquí tengo.</w:t>
+        <w:t>El de Madrid, sí. Aunque mi abuela era de Burriana, así que algo de aquí tengo.</w:t>
       </w:r>
     </w:p>
     <w:p>
@@ -2785,7 +2785,7 @@
           <w:color w:val="1F5A8C"/>
           <w:sz w:val="21"/>
         </w:rPr>
-        <w:t>Lucía:</w:t>
+        <w:t>Lucas:</w:t>
       </w:r>
       <w:r>
         <w:rPr>
@@ -2837,7 +2837,7 @@
           <w:color w:val="1F5A8C"/>
           <w:sz w:val="21"/>
         </w:rPr>
-        <w:t>Lucía:</w:t>
+        <w:t>Lucas:</w:t>
       </w:r>
       <w:r>
         <w:rPr>
@@ -2949,7 +2949,7 @@
           <w:sz w:val="22"/>
         </w:rPr>
         <w:tab/>
-        <w:t>(suspira) Pues esta vez lo hablaremos los tres. Lucía también tiene que oír cómo se negocia aquí.</w:t>
+        <w:t>(suspira) Pues esta vez lo hablaremos los tres. Lucas también tiene que oír cómo se negocia aquí.</w:t>
       </w:r>
     </w:p>
     <w:p>
@@ -2990,7 +2990,7 @@
           <w:sz w:val="22"/>
         </w:rPr>
         <w:tab/>
-        <w:t>Lucía, en esta casa la sobremesa es sagrada. Aquí se toman las decisiones, no en las reuniones.</w:t>
+        <w:t>Lucas, en esta casa la sobremesa es sagrada. Aquí se toman las decisiones, no en las reuniones.</w:t>
       </w:r>
     </w:p>
     <w:p>
@@ -3008,7 +3008,7 @@
           <w:color w:val="1F5A8C"/>
           <w:sz w:val="21"/>
         </w:rPr>
-        <w:t>Lucía:</w:t>
+        <w:t>Lucas:</w:t>
       </w:r>
       <w:r>
         <w:rPr>
@@ -3042,7 +3042,7 @@
           <w:sz w:val="22"/>
         </w:rPr>
         <w:tab/>
-        <w:t>Y muchos carajillos. (por primera vez, sonríe) Bienvenida.</w:t>
+        <w:t>Y muchos carajillos. (por primera vez, sonríe) Bienvenido.</w:t>
       </w:r>
     </w:p>
     <w:p>
@@ -3090,7 +3090,7 @@
           <w:color w:val="1F5A8C"/>
           <w:sz w:val="21"/>
         </w:rPr>
-        <w:t>Lucía:</w:t>
+        <w:t>Lucas:</w:t>
       </w:r>
       <w:r>
         <w:rPr>
@@ -3098,7 +3098,7 @@
           <w:sz w:val="22"/>
         </w:rPr>
         <w:tab/>
-        <w:t>Cerámicas Albalat, buenas tardes. Le habla Lucía Ferrer.</w:t>
+        <w:t>Cerámicas Albalat, buenas tardes. Le habla Lucas Ferrer.</w:t>
       </w:r>
     </w:p>
     <w:p>
@@ -3142,7 +3142,7 @@
           <w:color w:val="1F5A8C"/>
           <w:sz w:val="21"/>
         </w:rPr>
-        <w:t>Lucía:</w:t>
+        <w:t>Lucas:</w:t>
       </w:r>
       <w:r>
         <w:rPr>
@@ -3176,7 +3176,7 @@
           <w:sz w:val="22"/>
         </w:rPr>
         <w:tab/>
-        <w:t>Buenas tardes, licenciada. Habla Alejandra Garza, de Garza Acabados, en Monterrey, México.</w:t>
+        <w:t>Buenas tardes, licenciado. Habla Alejandra Garza, de Garza Acabados, en Monterrey, México.</w:t>
       </w:r>
     </w:p>
     <w:p>
@@ -3194,7 +3194,7 @@
           <w:color w:val="1F5A8C"/>
           <w:sz w:val="21"/>
         </w:rPr>
-        <w:t>Lucía:</w:t>
+        <w:t>Lucas:</w:t>
       </w:r>
       <w:r>
         <w:rPr>
@@ -3202,7 +3202,7 @@
           <w:sz w:val="22"/>
         </w:rPr>
         <w:tab/>
-        <w:t>Encantada, señora Garza. ¿En qué puedo ayudarla?</w:t>
+        <w:t>Encantado, señora Garza. ¿En qué puedo ayudarla?</w:t>
       </w:r>
     </w:p>
     <w:p>
@@ -3246,7 +3246,7 @@
           <w:color w:val="1F5A8C"/>
           <w:sz w:val="21"/>
         </w:rPr>
-        <w:t>Lucía:</w:t>
+        <w:t>Lucas:</w:t>
       </w:r>
       <w:r>
         <w:rPr>
@@ -3298,7 +3298,7 @@
           <w:color w:val="1F5A8C"/>
           <w:sz w:val="21"/>
         </w:rPr>
-        <w:t>Lucía:</w:t>
+        <w:t>Lucas:</w:t>
       </w:r>
       <w:r>
         <w:rPr>
@@ -3350,7 +3350,7 @@
           <w:color w:val="1F5A8C"/>
           <w:sz w:val="21"/>
         </w:rPr>
-        <w:t>Lucía:</w:t>
+        <w:t>Lucas:</w:t>
       </w:r>
       <w:r>
         <w:rPr>
@@ -3384,7 +3384,7 @@
           <w:sz w:val="22"/>
         </w:rPr>
         <w:tab/>
-        <w:t>(ríe) No, licenciada, ahorita no es ahora mismo. Ahorita es... pronto. Esta semana, pues.</w:t>
+        <w:t>(ríe) No, licenciado, ahorita no es ahora mismo. Ahorita es... pronto. Esta semana, pues.</w:t>
       </w:r>
     </w:p>
     <w:p>
@@ -3402,7 +3402,7 @@
           <w:color w:val="1F5A8C"/>
           <w:sz w:val="21"/>
         </w:rPr>
-        <w:t>Lucía:</w:t>
+        <w:t>Lucas:</w:t>
       </w:r>
       <w:r>
         <w:rPr>
@@ -3454,7 +3454,7 @@
           <w:color w:val="1F5A8C"/>
           <w:sz w:val="21"/>
         </w:rPr>
-        <w:t>Lucía:</w:t>
+        <w:t>Lucas:</w:t>
       </w:r>
       <w:r>
         <w:rPr>
@@ -3506,7 +3506,7 @@
           <w:color w:val="1F5A8C"/>
           <w:sz w:val="21"/>
         </w:rPr>
-        <w:t>Lucía:</w:t>
+        <w:t>Lucas:</w:t>
       </w:r>
       <w:r>
         <w:rPr>
@@ -3558,7 +3558,7 @@
           <w:color w:val="1F5A8C"/>
           <w:sz w:val="21"/>
         </w:rPr>
-        <w:t>Lucía:</w:t>
+        <w:t>Lucas:</w:t>
       </w:r>
       <w:r>
         <w:rPr>
@@ -3592,7 +3592,7 @@
           <w:sz w:val="22"/>
         </w:rPr>
         <w:tab/>
-        <w:t>Perfecto. Una cosa más, licenciada, para que lo sepa: el viernes me reúno con un proveedor italiano.</w:t>
+        <w:t>Perfecto. Una cosa más, licenciado, para que lo sepa: el viernes me reúno con un proveedor italiano.</w:t>
       </w:r>
     </w:p>
     <w:p>
@@ -3610,7 +3610,7 @@
           <w:color w:val="1F5A8C"/>
           <w:sz w:val="21"/>
         </w:rPr>
-        <w:t>Lucía:</w:t>
+        <w:t>Lucas:</w:t>
       </w:r>
       <w:r>
         <w:rPr>
@@ -3662,7 +3662,7 @@
           <w:color w:val="1F5A8C"/>
           <w:sz w:val="21"/>
         </w:rPr>
-        <w:t>Lucía:</w:t>
+        <w:t>Lucas:</w:t>
       </w:r>
       <w:r>
         <w:rPr>
@@ -3696,7 +3696,7 @@
           <w:sz w:val="22"/>
         </w:rPr>
         <w:tab/>
-        <w:t>Ándale, pues. Hasta luego, licenciada.</w:t>
+        <w:t>Ándale, pues. Hasta luego, licenciado.</w:t>
       </w:r>
     </w:p>
     <w:p>
@@ -3711,7 +3711,7 @@
           <w:color w:val="666666"/>
           <w:sz w:val="19"/>
         </w:rPr>
-        <w:t>Lucía cuelga. Se levanta y clava una chincheta roja en Monterrey. Luego abre el ordenador: no existe ninguna tarifa de exportación para México.</w:t>
+        <w:t>Lucas cuelga. Se levanta y clava una chincheta roja en Monterrey. Luego abre el ordenador: no existe ninguna tarifa de exportación para México.</w:t>
       </w:r>
     </w:p>
     <w:p>
@@ -3729,7 +3729,7 @@
           <w:color w:val="1F5A8C"/>
           <w:sz w:val="21"/>
         </w:rPr>
-        <w:t>Lucía:</w:t>
+        <w:t>Lucas:</w:t>
       </w:r>
       <w:r>
         <w:rPr>
@@ -3737,7 +3737,7 @@
           <w:sz w:val="22"/>
         </w:rPr>
         <w:tab/>
-        <w:t>(para sí) Sesenta mil metros, un horno parado y cuatro días. Primer día, Lucía. Primer día.</w:t>
+        <w:t>(para sí) Sesenta mil metros, un horno parado y cuatro días. Primer día, Lucas. Primer día.</w:t>
       </w:r>
     </w:p>
     <w:p>
@@ -3831,7 +3831,7 @@
                 <w:color w:val="FFFFFF"/>
                 <w:sz w:val="19"/>
               </w:rPr>
-              <w:t>스페인 (루시아)</w:t>
+              <w:t>스페인 (루카스)</w:t>
             </w:r>
           </w:p>
         </w:tc>
@@ -4726,7 +4726,7 @@
                 <w:b/>
                 <w:sz w:val="19"/>
               </w:rPr>
-              <w:t>señora / (이름)</w:t>
+              <w:t>señora / señor / (이름)</w:t>
             </w:r>
           </w:p>
         </w:tc>
@@ -4745,7 +4745,7 @@
                 <w:b w:val="0"/>
                 <w:sz w:val="19"/>
               </w:rPr>
-              <w:t>licenciada</w:t>
+              <w:t>licenciado / licenciada</w:t>
             </w:r>
           </w:p>
         </w:tc>
@@ -4764,7 +4764,7 @@
                 <w:b w:val="0"/>
                 <w:sz w:val="19"/>
               </w:rPr>
-              <w:t>멕시코에서 대졸 전문직을 부르는 경칭</w:t>
+              <w:t>멕시코에서 대졸 전문직을 부르는 경칭. 알레한드라는 루카스를 licenciado라 부른다</w:t>
             </w:r>
           </w:p>
         </w:tc>
@@ -7406,7 +7406,7 @@
           <w:rFonts w:ascii="Calibri" w:hAnsi="Calibri" w:eastAsia="Malgun Gothic"/>
           <w:sz w:val="20"/>
         </w:rPr>
-        <w:t>여러분은 루시아입니다. 대표에게 회사의 진짜 상황을 묻고 싶지만 너무 직설적이면 안 됩니다. ¿Puedo hacerte una pregunta…?, ¿Cómo está realmente…?, Eso no es una respuesta 같은 표현을 부드럽게 바꿔 말해 보세요.</w:t>
+        <w:t>여러분은 루카스입니다. 대표에게 회사의 진짜 상황을 묻고 싶지만 너무 직설적이면 안 됩니다. ¿Puedo hacerte una pregunta…?, ¿Cómo está realmente…?, Eso no es una respuesta 같은 표현을 부드럽게 바꿔 말해 보세요.</w:t>
       </w:r>
     </w:p>
     <w:p>
@@ -7533,7 +7533,7 @@
           <w:rFonts w:ascii="Calibri" w:hAnsi="Calibri" w:eastAsia="Malgun Gothic"/>
           <w:sz w:val="20"/>
         </w:rPr>
-        <w:t>멕시코에서는 대학을 나온 전문직 상대를 licenciado/licenciada(약어 Lic.)라고 부르는 일이 흔하다. 또 ahorita는 문맥에 따라 '지금 당장'에서 '언젠가'까지 폭넓게 쓰이므로, 비즈니스에서는 구체적인 날짜를 확인하는 습관이 중요하다.</w:t>
+        <w:t>멕시코에서는 대학을 나온 전문직 상대를 licenciado(남)/licenciada(여)(약어 Lic.)라고 부르는 일이 흔하다. 또 ahorita는 문맥에 따라 '지금 당장'에서 '언젠가'까지 폭넓게 쓰이므로, 비즈니스에서는 구체적인 날짜를 확인하는 습관이 중요하다.</w:t>
       </w:r>
     </w:p>
     <w:p>
@@ -7603,7 +7603,7 @@
           <w:color w:val="666666"/>
           <w:sz w:val="19"/>
         </w:rPr>
-        <w:t>2월 3일 월요일. 오렌지 밭 위로 안개가 깔려 있다. 팰릿을 실은 트럭 한 대가 세라미카스 알발라트의 정문을 빠져나간다. 34세의 루시아 페레르가 마드리드 번호판을 단 차를 경비실 옆에 세운다.</w:t>
+        <w:t>2월 3일 월요일. 오렌지 밭 위로 안개가 깔려 있다. 팰릿을 실은 트럭 한 대가 세라미카스 알발라트의 정문을 빠져나간다. 34세의 루카스 페레르가 마드리드 번호판을 단 차를 경비실 옆에 세운다.</w:t>
       </w:r>
     </w:p>
     <w:p>
@@ -7647,7 +7647,7 @@
           <w:color w:val="1F5A8C"/>
           <w:sz w:val="21"/>
         </w:rPr>
-        <w:t>Lucía:</w:t>
+        <w:t>Lucas:</w:t>
       </w:r>
       <w:r>
         <w:rPr>
@@ -7655,7 +7655,7 @@
           <w:sz w:val="21"/>
         </w:rPr>
         <w:tab/>
-        <w:t>안녕하세요. 루시아 페레르입니다. 오늘부터 여기서 일해요. 요렌스 씨와 약속이 있어요.</w:t>
+        <w:t>안녕하세요. 루카스 페레르입니다. 오늘부터 여기서 일해요. 요렌스 씨와 약속이 있어요.</w:t>
       </w:r>
     </w:p>
     <w:p>
@@ -7699,7 +7699,7 @@
           <w:color w:val="1F5A8C"/>
           <w:sz w:val="21"/>
         </w:rPr>
-        <w:t>Lucía:</w:t>
+        <w:t>Lucas:</w:t>
       </w:r>
       <w:r>
         <w:rPr>
@@ -7748,7 +7748,7 @@
           <w:color w:val="666666"/>
           <w:sz w:val="19"/>
         </w:rPr>
-        <w:t>루시아가 반사 조끼와 보안경을 쓴다. 안은 귀가 먹먹할 만큼 시끄럽다. 파란 작업복을 입은 예순 살쯤 된 남자가 손을 든다.</w:t>
+        <w:t>루카스가 반사 조끼와 보안경을 쓴다. 안은 귀가 먹먹할 만큼 시끄럽다. 파란 작업복을 입은 예순 살쯤 된 남자가 손을 든다.</w:t>
       </w:r>
     </w:p>
     <w:p>
@@ -7774,7 +7774,7 @@
           <w:sz w:val="21"/>
         </w:rPr>
         <w:tab/>
-        <w:t>봉 디아! 네가 루시아구나. 난 페페, 공장장이야. 여기선 다들 반말해, 알겠지?</w:t>
+        <w:t>봉 디아! 네가 루카스구나. 난 페페, 공장장이야. 여기선 다들 반말해, 알겠지?</w:t>
       </w:r>
     </w:p>
     <w:p>
@@ -7792,7 +7792,7 @@
           <w:color w:val="1F5A8C"/>
           <w:sz w:val="21"/>
         </w:rPr>
-        <w:t>Lucía:</w:t>
+        <w:t>Lucas:</w:t>
       </w:r>
       <w:r>
         <w:rPr>
@@ -7844,7 +7844,7 @@
           <w:color w:val="1F5A8C"/>
           <w:sz w:val="21"/>
         </w:rPr>
-        <w:t>Lucía:</w:t>
+        <w:t>Lucas:</w:t>
       </w:r>
       <w:r>
         <w:rPr>
@@ -7896,7 +7896,7 @@
           <w:color w:val="1F5A8C"/>
           <w:sz w:val="21"/>
         </w:rPr>
-        <w:t>Lucía:</w:t>
+        <w:t>Lucas:</w:t>
       </w:r>
       <w:r>
         <w:rPr>
@@ -7948,7 +7948,7 @@
           <w:color w:val="1F5A8C"/>
           <w:sz w:val="21"/>
         </w:rPr>
-        <w:t>Lucía:</w:t>
+        <w:t>Lucas:</w:t>
       </w:r>
       <w:r>
         <w:rPr>
@@ -8000,7 +8000,7 @@
           <w:color w:val="1F5A8C"/>
           <w:sz w:val="21"/>
         </w:rPr>
-        <w:t>Lucía:</w:t>
+        <w:t>Lucas:</w:t>
       </w:r>
       <w:r>
         <w:rPr>
@@ -8052,7 +8052,7 @@
           <w:color w:val="1F5A8C"/>
           <w:sz w:val="21"/>
         </w:rPr>
-        <w:t>Lucía:</w:t>
+        <w:t>Lucas:</w:t>
       </w:r>
       <w:r>
         <w:rPr>
@@ -8104,7 +8104,7 @@
           <w:color w:val="1F5A8C"/>
           <w:sz w:val="21"/>
         </w:rPr>
-        <w:t>Lucía:</w:t>
+        <w:t>Lucas:</w:t>
       </w:r>
       <w:r>
         <w:rPr>
@@ -8156,7 +8156,7 @@
           <w:color w:val="1F5A8C"/>
           <w:sz w:val="21"/>
         </w:rPr>
-        <w:t>Lucía:</w:t>
+        <w:t>Lucas:</w:t>
       </w:r>
       <w:r>
         <w:rPr>
@@ -8208,7 +8208,7 @@
           <w:color w:val="1F5A8C"/>
           <w:sz w:val="21"/>
         </w:rPr>
-        <w:t>Lucía:</w:t>
+        <w:t>Lucas:</w:t>
       </w:r>
       <w:r>
         <w:rPr>
@@ -8260,7 +8260,7 @@
           <w:color w:val="1F5A8C"/>
           <w:sz w:val="21"/>
         </w:rPr>
-        <w:t>Lucía:</w:t>
+        <w:t>Lucas:</w:t>
       </w:r>
       <w:r>
         <w:rPr>
@@ -8327,7 +8327,7 @@
           <w:color w:val="1F5A8C"/>
           <w:sz w:val="21"/>
         </w:rPr>
-        <w:t>Lucía:</w:t>
+        <w:t>Lucas:</w:t>
       </w:r>
       <w:r>
         <w:rPr>
@@ -8379,7 +8379,7 @@
           <w:color w:val="1F5A8C"/>
           <w:sz w:val="21"/>
         </w:rPr>
-        <w:t>Lucía:</w:t>
+        <w:t>Lucas:</w:t>
       </w:r>
       <w:r>
         <w:rPr>
@@ -8431,7 +8431,7 @@
           <w:color w:val="1F5A8C"/>
           <w:sz w:val="21"/>
         </w:rPr>
-        <w:t>Lucía:</w:t>
+        <w:t>Lucas:</w:t>
       </w:r>
       <w:r>
         <w:rPr>
@@ -8483,7 +8483,7 @@
           <w:color w:val="1F5A8C"/>
           <w:sz w:val="21"/>
         </w:rPr>
-        <w:t>Lucía:</w:t>
+        <w:t>Lucas:</w:t>
       </w:r>
       <w:r>
         <w:rPr>
@@ -8535,7 +8535,7 @@
           <w:color w:val="1F5A8C"/>
           <w:sz w:val="21"/>
         </w:rPr>
-        <w:t>Lucía:</w:t>
+        <w:t>Lucas:</w:t>
       </w:r>
       <w:r>
         <w:rPr>
@@ -8587,7 +8587,7 @@
           <w:color w:val="1F5A8C"/>
           <w:sz w:val="21"/>
         </w:rPr>
-        <w:t>Lucía:</w:t>
+        <w:t>Lucas:</w:t>
       </w:r>
       <w:r>
         <w:rPr>
@@ -8639,7 +8639,7 @@
           <w:color w:val="1F5A8C"/>
           <w:sz w:val="21"/>
         </w:rPr>
-        <w:t>Lucía:</w:t>
+        <w:t>Lucas:</w:t>
       </w:r>
       <w:r>
         <w:rPr>
@@ -8706,7 +8706,7 @@
           <w:color w:val="1F5A8C"/>
           <w:sz w:val="21"/>
         </w:rPr>
-        <w:t>Lucía:</w:t>
+        <w:t>Lucas:</w:t>
       </w:r>
       <w:r>
         <w:rPr>
@@ -8758,7 +8758,7 @@
           <w:color w:val="1F5A8C"/>
           <w:sz w:val="21"/>
         </w:rPr>
-        <w:t>Lucía:</w:t>
+        <w:t>Lucas:</w:t>
       </w:r>
       <w:r>
         <w:rPr>
@@ -8810,7 +8810,7 @@
           <w:color w:val="1F5A8C"/>
           <w:sz w:val="21"/>
         </w:rPr>
-        <w:t>Lucía:</w:t>
+        <w:t>Lucas:</w:t>
       </w:r>
       <w:r>
         <w:rPr>
@@ -8862,7 +8862,7 @@
           <w:color w:val="1F5A8C"/>
           <w:sz w:val="21"/>
         </w:rPr>
-        <w:t>Lucía:</w:t>
+        <w:t>Lucas:</w:t>
       </w:r>
       <w:r>
         <w:rPr>
@@ -8914,7 +8914,7 @@
           <w:color w:val="1F5A8C"/>
           <w:sz w:val="21"/>
         </w:rPr>
-        <w:t>Lucía:</w:t>
+        <w:t>Lucas:</w:t>
       </w:r>
       <w:r>
         <w:rPr>
@@ -8948,7 +8948,7 @@
           <w:sz w:val="21"/>
         </w:rPr>
         <w:tab/>
-        <w:t>여기선 중요한 얘기는 밥 먹으면서 해, 루시아. 온다에 온 걸 환영해.</w:t>
+        <w:t>여기선 중요한 얘기는 밥 먹으면서 해, 루카스. 온다에 온 걸 환영해.</w:t>
       </w:r>
     </w:p>
     <w:p>
@@ -8979,7 +8979,7 @@
           <w:color w:val="666666"/>
           <w:sz w:val="19"/>
         </w:rPr>
-        <w:t>쌀 요리로 이 지역에서 유명한 식당. 64세의 비센테 알발라트가 안쪽 테이블에 먼저 앉아 있다가 그녀가 들어오자 일어선다.</w:t>
+        <w:t>쌀 요리로 이 지역에서 유명한 식당. 64세의 비센테 알발라트가 안쪽 테이블에 먼저 앉아 있다가 그가 들어오자 일어선다.</w:t>
       </w:r>
     </w:p>
     <w:p>
@@ -9005,7 +9005,7 @@
           <w:sz w:val="21"/>
         </w:rPr>
         <w:tab/>
-        <w:t>루시아! 앉아요, 앉아. 페페랑 보낸 오전은 어땠어요?</w:t>
+        <w:t>루카스! 앉아요, 앉아. 페페랑 보낸 오전은 어땠어요?</w:t>
       </w:r>
     </w:p>
     <w:p>
@@ -9023,7 +9023,7 @@
           <w:color w:val="1F5A8C"/>
           <w:sz w:val="21"/>
         </w:rPr>
-        <w:t>Lucía:</w:t>
+        <w:t>Lucas:</w:t>
       </w:r>
       <w:r>
         <w:rPr>
@@ -9075,7 +9075,7 @@
           <w:color w:val="1F5A8C"/>
           <w:sz w:val="21"/>
         </w:rPr>
-        <w:t>Lucía:</w:t>
+        <w:t>Lucas:</w:t>
       </w:r>
       <w:r>
         <w:rPr>
@@ -9127,7 +9127,7 @@
           <w:color w:val="1F5A8C"/>
           <w:sz w:val="21"/>
         </w:rPr>
-        <w:t>Lucía:</w:t>
+        <w:t>Lucas:</w:t>
       </w:r>
       <w:r>
         <w:rPr>
@@ -9179,7 +9179,7 @@
           <w:color w:val="1F5A8C"/>
           <w:sz w:val="21"/>
         </w:rPr>
-        <w:t>Lucía:</w:t>
+        <w:t>Lucas:</w:t>
       </w:r>
       <w:r>
         <w:rPr>
@@ -9231,7 +9231,7 @@
           <w:color w:val="1F5A8C"/>
           <w:sz w:val="21"/>
         </w:rPr>
-        <w:t>Lucía:</w:t>
+        <w:t>Lucas:</w:t>
       </w:r>
       <w:r>
         <w:rPr>
@@ -9283,7 +9283,7 @@
           <w:color w:val="1F5A8C"/>
           <w:sz w:val="21"/>
         </w:rPr>
-        <w:t>Lucía:</w:t>
+        <w:t>Lucas:</w:t>
       </w:r>
       <w:r>
         <w:rPr>
@@ -9335,7 +9335,7 @@
           <w:color w:val="1F5A8C"/>
           <w:sz w:val="21"/>
         </w:rPr>
-        <w:t>Lucía:</w:t>
+        <w:t>Lucas:</w:t>
       </w:r>
       <w:r>
         <w:rPr>
@@ -9387,7 +9387,7 @@
           <w:color w:val="1F5A8C"/>
           <w:sz w:val="21"/>
         </w:rPr>
-        <w:t>Lucía:</w:t>
+        <w:t>Lucas:</w:t>
       </w:r>
       <w:r>
         <w:rPr>
@@ -9439,7 +9439,7 @@
           <w:color w:val="1F5A8C"/>
           <w:sz w:val="21"/>
         </w:rPr>
-        <w:t>Lucía:</w:t>
+        <w:t>Lucas:</w:t>
       </w:r>
       <w:r>
         <w:rPr>
@@ -9491,7 +9491,7 @@
           <w:color w:val="1F5A8C"/>
           <w:sz w:val="21"/>
         </w:rPr>
-        <w:t>Lucía:</w:t>
+        <w:t>Lucas:</w:t>
       </w:r>
       <w:r>
         <w:rPr>
@@ -9584,7 +9584,7 @@
           <w:color w:val="1F5A8C"/>
           <w:sz w:val="21"/>
         </w:rPr>
-        <w:t>Lucía:</w:t>
+        <w:t>Lucas:</w:t>
       </w:r>
       <w:r>
         <w:rPr>
@@ -9636,7 +9636,7 @@
           <w:color w:val="1F5A8C"/>
           <w:sz w:val="21"/>
         </w:rPr>
-        <w:t>Lucía:</w:t>
+        <w:t>Lucas:</w:t>
       </w:r>
       <w:r>
         <w:rPr>
@@ -9688,7 +9688,7 @@
           <w:color w:val="1F5A8C"/>
           <w:sz w:val="21"/>
         </w:rPr>
-        <w:t>Lucía:</w:t>
+        <w:t>Lucas:</w:t>
       </w:r>
       <w:r>
         <w:rPr>
@@ -9722,7 +9722,7 @@
           <w:sz w:val="21"/>
         </w:rPr>
         <w:tab/>
-        <w:t>많은 사람의 발을 밟게 될 거예요, 루시아. 내가 바라는 게 바로 그거예요. 다만 조심해서 밟아요.</w:t>
+        <w:t>많은 사람의 발을 밟게 될 거예요, 루카스. 내가 바라는 게 바로 그거예요. 다만 조심해서 밟아요.</w:t>
       </w:r>
     </w:p>
     <w:p>
@@ -9789,7 +9789,7 @@
           <w:sz w:val="21"/>
         </w:rPr>
         <w:tab/>
-        <w:t>암파로, 앉아라. 루시아 페레르 씨다.</w:t>
+        <w:t>암파로, 앉아라. 루카스 페레르 씨다.</w:t>
       </w:r>
     </w:p>
     <w:p>
@@ -9833,7 +9833,7 @@
           <w:color w:val="1F5A8C"/>
           <w:sz w:val="21"/>
         </w:rPr>
-        <w:t>Lucía:</w:t>
+        <w:t>Lucas:</w:t>
       </w:r>
       <w:r>
         <w:rPr>
@@ -9937,7 +9937,7 @@
           <w:color w:val="1F5A8C"/>
           <w:sz w:val="21"/>
         </w:rPr>
-        <w:t>Lucía:</w:t>
+        <w:t>Lucas:</w:t>
       </w:r>
       <w:r>
         <w:rPr>
@@ -9989,7 +9989,7 @@
           <w:color w:val="1F5A8C"/>
           <w:sz w:val="21"/>
         </w:rPr>
-        <w:t>Lucía:</w:t>
+        <w:t>Lucas:</w:t>
       </w:r>
       <w:r>
         <w:rPr>
@@ -10101,7 +10101,7 @@
           <w:sz w:val="21"/>
         </w:rPr>
         <w:tab/>
-        <w:t>(한숨 쉬며) 이번엔 셋이서 얘기하자. 루시아도 여기서 협상을 어떻게 하는지 들어 봐야 하니까.</w:t>
+        <w:t>(한숨 쉬며) 이번엔 셋이서 얘기하자. 루카스도 여기서 협상을 어떻게 하는지 들어 봐야 하니까.</w:t>
       </w:r>
     </w:p>
     <w:p>
@@ -10142,7 +10142,7 @@
           <w:sz w:val="21"/>
         </w:rPr>
         <w:tab/>
-        <w:t>루시아, 이 회사에서 식후 담소는 신성해요. 결정은 회의가 아니라 여기서 내려지죠.</w:t>
+        <w:t>루카스, 이 회사에서 식후 담소는 신성해요. 결정은 회의가 아니라 여기서 내려지죠.</w:t>
       </w:r>
     </w:p>
     <w:p>
@@ -10160,7 +10160,7 @@
           <w:color w:val="1F5A8C"/>
           <w:sz w:val="21"/>
         </w:rPr>
-        <w:t>Lucía:</w:t>
+        <w:t>Lucas:</w:t>
       </w:r>
       <w:r>
         <w:rPr>
@@ -10243,7 +10243,7 @@
           <w:color w:val="1F5A8C"/>
           <w:sz w:val="21"/>
         </w:rPr>
-        <w:t>Lucía:</w:t>
+        <w:t>Lucas:</w:t>
       </w:r>
       <w:r>
         <w:rPr>
@@ -10251,7 +10251,7 @@
           <w:sz w:val="21"/>
         </w:rPr>
         <w:tab/>
-        <w:t>세라미카스 알발라트입니다, 안녕하세요. 루시아 페레르입니다.</w:t>
+        <w:t>세라미카스 알발라트입니다, 안녕하세요. 루카스 페레르입니다.</w:t>
       </w:r>
     </w:p>
     <w:p>
@@ -10295,7 +10295,7 @@
           <w:color w:val="1F5A8C"/>
           <w:sz w:val="21"/>
         </w:rPr>
-        <w:t>Lucía:</w:t>
+        <w:t>Lucas:</w:t>
       </w:r>
       <w:r>
         <w:rPr>
@@ -10347,7 +10347,7 @@
           <w:color w:val="1F5A8C"/>
           <w:sz w:val="21"/>
         </w:rPr>
-        <w:t>Lucía:</w:t>
+        <w:t>Lucas:</w:t>
       </w:r>
       <w:r>
         <w:rPr>
@@ -10399,7 +10399,7 @@
           <w:color w:val="1F5A8C"/>
           <w:sz w:val="21"/>
         </w:rPr>
-        <w:t>Lucía:</w:t>
+        <w:t>Lucas:</w:t>
       </w:r>
       <w:r>
         <w:rPr>
@@ -10451,7 +10451,7 @@
           <w:color w:val="1F5A8C"/>
           <w:sz w:val="21"/>
         </w:rPr>
-        <w:t>Lucía:</w:t>
+        <w:t>Lucas:</w:t>
       </w:r>
       <w:r>
         <w:rPr>
@@ -10503,7 +10503,7 @@
           <w:color w:val="1F5A8C"/>
           <w:sz w:val="21"/>
         </w:rPr>
-        <w:t>Lucía:</w:t>
+        <w:t>Lucas:</w:t>
       </w:r>
       <w:r>
         <w:rPr>
@@ -10555,7 +10555,7 @@
           <w:color w:val="1F5A8C"/>
           <w:sz w:val="21"/>
         </w:rPr>
-        <w:t>Lucía:</w:t>
+        <w:t>Lucas:</w:t>
       </w:r>
       <w:r>
         <w:rPr>
@@ -10607,7 +10607,7 @@
           <w:color w:val="1F5A8C"/>
           <w:sz w:val="21"/>
         </w:rPr>
-        <w:t>Lucía:</w:t>
+        <w:t>Lucas:</w:t>
       </w:r>
       <w:r>
         <w:rPr>
@@ -10659,7 +10659,7 @@
           <w:color w:val="1F5A8C"/>
           <w:sz w:val="21"/>
         </w:rPr>
-        <w:t>Lucía:</w:t>
+        <w:t>Lucas:</w:t>
       </w:r>
       <w:r>
         <w:rPr>
@@ -10711,7 +10711,7 @@
           <w:color w:val="1F5A8C"/>
           <w:sz w:val="21"/>
         </w:rPr>
-        <w:t>Lucía:</w:t>
+        <w:t>Lucas:</w:t>
       </w:r>
       <w:r>
         <w:rPr>
@@ -10763,7 +10763,7 @@
           <w:color w:val="1F5A8C"/>
           <w:sz w:val="21"/>
         </w:rPr>
-        <w:t>Lucía:</w:t>
+        <w:t>Lucas:</w:t>
       </w:r>
       <w:r>
         <w:rPr>
@@ -10815,7 +10815,7 @@
           <w:color w:val="1F5A8C"/>
           <w:sz w:val="21"/>
         </w:rPr>
-        <w:t>Lucía:</w:t>
+        <w:t>Lucas:</w:t>
       </w:r>
       <w:r>
         <w:rPr>
@@ -10864,7 +10864,7 @@
           <w:color w:val="666666"/>
           <w:sz w:val="19"/>
         </w:rPr>
-        <w:t>루시아가 전화를 끊는다. 일어나서 몬테레이에 빨간 압정을 꽂는다. 그리고 컴퓨터를 켠다. 멕시코용 수출 가격표는 어디에도 없다.</w:t>
+        <w:t>루카스가 전화를 끊는다. 일어나서 몬테레이에 빨간 압정을 꽂는다. 그리고 컴퓨터를 켠다. 멕시코용 수출 가격표는 어디에도 없다.</w:t>
       </w:r>
     </w:p>
     <w:p>
@@ -10882,7 +10882,7 @@
           <w:color w:val="1F5A8C"/>
           <w:sz w:val="21"/>
         </w:rPr>
-        <w:t>Lucía:</w:t>
+        <w:t>Lucas:</w:t>
       </w:r>
       <w:r>
         <w:rPr>
@@ -10890,7 +10890,7 @@
           <w:sz w:val="21"/>
         </w:rPr>
         <w:tab/>
-        <w:t>(혼잣말로) 6만 제곱미터, 멈춘 가마 하나, 그리고 나흘. 첫날이야, 루시아. 첫날.</w:t>
+        <w:t>(혼잣말로) 6만 제곱미터, 멈춘 가마 하나, 그리고 나흘. 첫날이야, 루카스. 첫날.</w:t>
       </w:r>
     </w:p>
     <w:p>
@@ -10905,7 +10905,7 @@
           <w:color w:val="1F3A5F"/>
           <w:sz w:val="20"/>
         </w:rPr>
-        <w:t>다음 화 예고 · Próximo episodio — 제2화 « El idioma de la fábrica » — 금요일까지 나흘. 루시아는 샘플을 만들기 위해 페페에게 가마 일정을 바꿔 달라고 부탁해야 한다. 그런데 공장의 말은 컨설팅 회사의 말과 전혀 다르다.</w:t>
+        <w:t>다음 화 예고 · Próximo episodio — 제2화 « El idioma de la fábrica » — 금요일까지 나흘. 루카스는 샘플을 만들기 위해 페페에게 가마 일정을 바꿔 달라고 부탁해야 한다. 그런데 공장의 말은 컨설팅 회사의 말과 전혀 다르다.</w:t>
       </w:r>
     </w:p>
     <w:sectPr>

</xml_diff>